<commit_message>
Confirm 13-21 June coverage; fold in newly-registered framework IDs
- Verified the e-Qanun register holds zero documents for 13-14 June, so there
  is no gap between Issue No. 1 (through 13 June) and Issue No. 2.
- The register has since assigned framework IDs to two more 19 June items:
  preschool PPP decree (62031) and Lisbon embassy order (62032). Added these
  to the entries and the register table.
- Refined the registration-lag note (remaining five 19 June decrees, Cabinet
  184-186 and implementing orders still pending).

Co-Authored-By: Claude Opus 4.8 <noreply@anthropic.com>
Claude-Session: https://claude.ai/code/session_01UuQxxsewweBVpoDxNvZeDu
</commit_message>
<xml_diff>
--- a/scripts/gazettes/gazette-2026-06-22.docx
+++ b/scripts/gazettes/gazette-2026-06-22.docx
@@ -1019,6 +1019,16 @@
           <w:rFonts w:ascii="Arial" w:hAnsi="Arial"/>
           <w:b w:val="0"/>
           <w:i w:val="0"/>
+          <w:color w:val="555555"/>
+          <w:sz w:val="15"/>
+        </w:rPr>
+        <w:t xml:space="preserve">  e-Qanun id 62031</w:t>
+      </w:r>
+      <w:r>
+        <w:rPr>
+          <w:rFonts w:ascii="Arial" w:hAnsi="Arial"/>
+          <w:b w:val="0"/>
+          <w:i w:val="0"/>
           <w:color w:val="888888"/>
           <w:sz w:val="15"/>
         </w:rPr>
@@ -1578,6 +1588,16 @@
           <w:shd w:val="clear" w:color="auto" w:fill="4a4a4a"/>
         </w:rPr>
         <w:t xml:space="preserve">  ORDER  </w:t>
+      </w:r>
+      <w:r>
+        <w:rPr>
+          <w:rFonts w:ascii="Arial" w:hAnsi="Arial"/>
+          <w:b w:val="0"/>
+          <w:i w:val="0"/>
+          <w:color w:val="555555"/>
+          <w:sz w:val="15"/>
+        </w:rPr>
+        <w:t xml:space="preserve">  e-Qanun id 62032</w:t>
       </w:r>
       <w:r>
         <w:rPr>
@@ -4496,7 +4516,7 @@
           <w:color w:val="555555"/>
           <w:sz w:val="18"/>
         </w:rPr>
-        <w:t>Aşağıdakı sənədlər tərtibat tarixinə (22 iyun) e-Qanun rəsmi reyestrində qeydiyyata alınmış və bu həftəyə (qəbul tarixi 15–22 iyun) aiddir. Qeyd: 19 iyun tarixli Prezident Fərmanları/Sərəncamı və Nazirlər Kabinetinin 184–186 saylı qərarları ilə icra sərəncamları hələ reyestrə daxil edilməmişdir — adətən bir neçə günlük qeydiyyat gecikməsi olur.</w:t>
+        <w:t>Aşağıdakı sənədlər tərtibat tarixinə e-Qanun rəsmi reyestrində qeydiyyata alınmışdır (13–14 iyun tarixlərində reyestrdə heç bir sənəd yoxdur). Reyestr mütəmadi yenilənir: 19 iyun tarixli məktəbəqədər təhsil Fərmanı (62031) və Lissabon Səfirliyi Sərəncamı (62032) artıq daxil edilmişdir; qalan beş 19 iyun Fərmanı, Nazirlər Kabinetinin 184–186 saylı qərarları və icra sərəncamları isə hələ qeydiyyatdadır (adətən bir neçə günlük gecikmə).</w:t>
       </w:r>
     </w:p>
     <w:p>
@@ -4511,7 +4531,7 @@
           <w:color w:val="555555"/>
           <w:sz w:val="18"/>
         </w:rPr>
-        <w:t>The documents below were registered in the official e-Qanun register as of the compilation date (22 June) and fall within this week (accept date 15–22 June). Note: the 19 June presidential instruments and Cabinet decisions 184–186 with their implementing orders had not yet been entered in the register — a registration lag of a few days is normal.</w:t>
+        <w:t>The documents below are registered in the official e-Qanun register as of compilation (the register holds nothing for 13–14 June). The register updates continuously: the 19 June preschool Decree (62031) and the Lisbon embassy Order (62032) have now been entered; the remaining five 19 June Decrees, Cabinet decisions 184–186 and the implementing orders are still pending registration (a normal few-day lag).</w:t>
       </w:r>
     </w:p>
     <w:tbl>
@@ -4709,6 +4729,200 @@
                 <w:sz w:val="16"/>
               </w:rPr>
               <w:t>Non-oil-and-gas export support — additional measures</w:t>
+            </w:r>
+          </w:p>
+        </w:tc>
+      </w:tr>
+      <w:tr>
+        <w:tc>
+          <w:tcPr>
+            <w:tcW w:type="dxa" w:w="2484"/>
+          </w:tcPr>
+          <w:p>
+            <w:pPr>
+              <w:spacing w:before="0" w:after="0"/>
+            </w:pPr>
+            <w:r>
+              <w:rPr>
+                <w:rFonts w:ascii="Arial" w:hAnsi="Arial"/>
+                <w:b/>
+                <w:i w:val="0"/>
+                <w:color w:val="1A1A1A"/>
+                <w:sz w:val="16"/>
+              </w:rPr>
+              <w:t>Decree</w:t>
+            </w:r>
+          </w:p>
+        </w:tc>
+        <w:tc>
+          <w:tcPr>
+            <w:tcW w:type="dxa" w:w="2484"/>
+          </w:tcPr>
+          <w:p>
+            <w:pPr>
+              <w:spacing w:before="0" w:after="0"/>
+            </w:pPr>
+            <w:r>
+              <w:rPr>
+                <w:rFonts w:ascii="Arial" w:hAnsi="Arial"/>
+                <w:b w:val="0"/>
+                <w:i w:val="0"/>
+                <w:color w:val="1A1A1A"/>
+                <w:sz w:val="16"/>
+              </w:rPr>
+              <w:t>19 Jun 2026</w:t>
+            </w:r>
+          </w:p>
+        </w:tc>
+        <w:tc>
+          <w:tcPr>
+            <w:tcW w:type="dxa" w:w="2484"/>
+          </w:tcPr>
+          <w:p>
+            <w:pPr>
+              <w:spacing w:before="0" w:after="0"/>
+            </w:pPr>
+            <w:r>
+              <w:rPr>
+                <w:rFonts w:ascii="Arial" w:hAnsi="Arial"/>
+                <w:b w:val="0"/>
+                <w:i w:val="0"/>
+                <w:color w:val="1A3A5A"/>
+                <w:sz w:val="16"/>
+              </w:rPr>
+              <w:t>/framework/62031</w:t>
+            </w:r>
+          </w:p>
+        </w:tc>
+        <w:tc>
+          <w:tcPr>
+            <w:tcW w:type="dxa" w:w="2484"/>
+          </w:tcPr>
+          <w:p>
+            <w:pPr>
+              <w:spacing w:before="0" w:after="20" w:line="288" w:lineRule="auto"/>
+            </w:pPr>
+            <w:r>
+              <w:rPr>
+                <w:rFonts w:ascii="Georgia" w:hAnsi="Georgia"/>
+                <w:b/>
+                <w:i w:val="0"/>
+                <w:color w:val="1A1A1A"/>
+                <w:sz w:val="17"/>
+              </w:rPr>
+              <w:t>Məktəbəqədər təhsildə valideyn–dövlət–özəl maliyyələşmə modeli (PPP)</w:t>
+            </w:r>
+          </w:p>
+          <w:p>
+            <w:pPr>
+              <w:spacing w:before="0" w:after="0" w:line="288" w:lineRule="auto"/>
+            </w:pPr>
+            <w:r>
+              <w:rPr>
+                <w:rFonts w:ascii="Georgia" w:hAnsi="Georgia"/>
+                <w:b w:val="0"/>
+                <w:i/>
+                <w:color w:val="555555"/>
+                <w:sz w:val="16"/>
+              </w:rPr>
+              <w:t>Preschool parent–state–private (PPP) financing model</w:t>
+            </w:r>
+          </w:p>
+        </w:tc>
+      </w:tr>
+      <w:tr>
+        <w:tc>
+          <w:tcPr>
+            <w:tcW w:type="dxa" w:w="2484"/>
+          </w:tcPr>
+          <w:p>
+            <w:pPr>
+              <w:spacing w:before="0" w:after="0"/>
+            </w:pPr>
+            <w:r>
+              <w:rPr>
+                <w:rFonts w:ascii="Arial" w:hAnsi="Arial"/>
+                <w:b/>
+                <w:i w:val="0"/>
+                <w:color w:val="1A1A1A"/>
+                <w:sz w:val="16"/>
+              </w:rPr>
+              <w:t>Order</w:t>
+            </w:r>
+          </w:p>
+        </w:tc>
+        <w:tc>
+          <w:tcPr>
+            <w:tcW w:type="dxa" w:w="2484"/>
+          </w:tcPr>
+          <w:p>
+            <w:pPr>
+              <w:spacing w:before="0" w:after="0"/>
+            </w:pPr>
+            <w:r>
+              <w:rPr>
+                <w:rFonts w:ascii="Arial" w:hAnsi="Arial"/>
+                <w:b w:val="0"/>
+                <w:i w:val="0"/>
+                <w:color w:val="1A1A1A"/>
+                <w:sz w:val="16"/>
+              </w:rPr>
+              <w:t>17 Jun 2026</w:t>
+            </w:r>
+          </w:p>
+        </w:tc>
+        <w:tc>
+          <w:tcPr>
+            <w:tcW w:type="dxa" w:w="2484"/>
+          </w:tcPr>
+          <w:p>
+            <w:pPr>
+              <w:spacing w:before="0" w:after="0"/>
+            </w:pPr>
+            <w:r>
+              <w:rPr>
+                <w:rFonts w:ascii="Arial" w:hAnsi="Arial"/>
+                <w:b w:val="0"/>
+                <w:i w:val="0"/>
+                <w:color w:val="1A3A5A"/>
+                <w:sz w:val="16"/>
+              </w:rPr>
+              <w:t>/framework/62032</w:t>
+            </w:r>
+          </w:p>
+        </w:tc>
+        <w:tc>
+          <w:tcPr>
+            <w:tcW w:type="dxa" w:w="2484"/>
+          </w:tcPr>
+          <w:p>
+            <w:pPr>
+              <w:spacing w:before="0" w:after="20" w:line="288" w:lineRule="auto"/>
+            </w:pPr>
+            <w:r>
+              <w:rPr>
+                <w:rFonts w:ascii="Georgia" w:hAnsi="Georgia"/>
+                <w:b/>
+                <w:i w:val="0"/>
+                <w:color w:val="1A1A1A"/>
+                <w:sz w:val="17"/>
+              </w:rPr>
+              <w:t>Portuqaliyada (Lissabon) Səfirliyin fəaliyyətinin təmin edilməsi</w:t>
+            </w:r>
+          </w:p>
+          <w:p>
+            <w:pPr>
+              <w:spacing w:before="0" w:after="0" w:line="288" w:lineRule="auto"/>
+            </w:pPr>
+            <w:r>
+              <w:rPr>
+                <w:rFonts w:ascii="Georgia" w:hAnsi="Georgia"/>
+                <w:b w:val="0"/>
+                <w:i/>
+                <w:color w:val="555555"/>
+                <w:sz w:val="16"/>
+              </w:rPr>
+              <w:t>Operation of the Embassy in Portugal (Lisbon)</w:t>
             </w:r>
           </w:p>
         </w:tc>

</xml_diff>